<commit_message>
fix: remover subtitulos de data/aula dos capitulos da apostila
</commit_message>
<xml_diff>
--- a/sistema/INTRODUCAO_A_TECNOLOGIA_DA_INFORMACAO_E_COMUNICACAO/AVALIACOES_CRIADAS/apostila_introducao_tic_2026_2.docx
+++ b/sistema/INTRODUCAO_A_TECNOLOGIA_DA_INFORMACAO_E_COMUNICACAO/AVALIACOES_CRIADAS/apostila_introducao_tic_2026_2.docx
@@ -1185,23 +1185,6 @@
     </w:p>
     <w:p>
       <w:pPr>
-        <w:spacing w:after="120" w:before="0"/>
-        <w:jc w:val="left"/>
-      </w:pPr>
-      <w:r>
-        <w:rPr>
-          <w:rFonts w:ascii="Arial" w:cs="Arial" w:eastAsia="Arial" w:hAnsi="Arial"/>
-          <w:i/>
-          <w:iCs/>
-          <w:color w:val="2E74B5"/>
-          <w:sz w:val="20"/>
-          <w:szCs w:val="20"/>
-        </w:rPr>
-        <w:t xml:space="preserve">Aula 01 · 03/08/2026</w:t>
-      </w:r>
-    </w:p>
-    <w:p>
-      <w:pPr>
         <w:shd w:fill="2E74B5" w:color="2E74B5" w:val="clear"/>
         <w:spacing w:after="120" w:before="280"/>
         <w:jc w:val="left"/>
@@ -6085,23 +6068,6 @@
     </w:p>
     <w:p>
       <w:pPr>
-        <w:spacing w:after="120" w:before="0"/>
-        <w:jc w:val="left"/>
-      </w:pPr>
-      <w:r>
-        <w:rPr>
-          <w:rFonts w:ascii="Arial" w:cs="Arial" w:eastAsia="Arial" w:hAnsi="Arial"/>
-          <w:i/>
-          <w:iCs/>
-          <w:color w:val="2E74B5"/>
-          <w:sz w:val="20"/>
-          <w:szCs w:val="20"/>
-        </w:rPr>
-        <w:t xml:space="preserve">Aula 03 · 05/08/2026</w:t>
-      </w:r>
-    </w:p>
-    <w:p>
-      <w:pPr>
         <w:shd w:fill="2E74B5" w:color="2E74B5" w:val="clear"/>
         <w:spacing w:after="120" w:before="280"/>
         <w:jc w:val="left"/>
@@ -8038,23 +8004,6 @@
     </w:p>
     <w:p>
       <w:pPr>
-        <w:spacing w:after="120" w:before="0"/>
-        <w:jc w:val="left"/>
-      </w:pPr>
-      <w:r>
-        <w:rPr>
-          <w:rFonts w:ascii="Arial" w:cs="Arial" w:eastAsia="Arial" w:hAnsi="Arial"/>
-          <w:i/>
-          <w:iCs/>
-          <w:color w:val="2E74B5"/>
-          <w:sz w:val="20"/>
-          <w:szCs w:val="20"/>
-        </w:rPr>
-        <w:t xml:space="preserve">Aula 03 · 05/08/2026</w:t>
-      </w:r>
-    </w:p>
-    <w:p>
-      <w:pPr>
         <w:shd w:fill="2E74B5" w:color="2E74B5" w:val="clear"/>
         <w:spacing w:after="120" w:before="280"/>
         <w:jc w:val="left"/>
@@ -9460,23 +9409,6 @@
     </w:p>
     <w:p>
       <w:pPr>
-        <w:spacing w:after="120" w:before="0"/>
-        <w:jc w:val="left"/>
-      </w:pPr>
-      <w:r>
-        <w:rPr>
-          <w:rFonts w:ascii="Arial" w:cs="Arial" w:eastAsia="Arial" w:hAnsi="Arial"/>
-          <w:i/>
-          <w:iCs/>
-          <w:color w:val="2E74B5"/>
-          <w:sz w:val="20"/>
-          <w:szCs w:val="20"/>
-        </w:rPr>
-        <w:t xml:space="preserve">Aula 04 · 06/08/2026</w:t>
-      </w:r>
-    </w:p>
-    <w:p>
-      <w:pPr>
         <w:shd w:fill="2E74B5" w:color="2E74B5" w:val="clear"/>
         <w:spacing w:after="120" w:before="280"/>
         <w:jc w:val="left"/>
@@ -10888,23 +10820,6 @@
     </w:p>
     <w:p>
       <w:pPr>
-        <w:spacing w:after="120" w:before="0"/>
-        <w:jc w:val="left"/>
-      </w:pPr>
-      <w:r>
-        <w:rPr>
-          <w:rFonts w:ascii="Arial" w:cs="Arial" w:eastAsia="Arial" w:hAnsi="Arial"/>
-          <w:i/>
-          <w:iCs/>
-          <w:color w:val="2E74B5"/>
-          <w:sz w:val="20"/>
-          <w:szCs w:val="20"/>
-        </w:rPr>
-        <w:t xml:space="preserve">Aula 05 · 07/08/2026</w:t>
-      </w:r>
-    </w:p>
-    <w:p>
-      <w:pPr>
         <w:shd w:fill="2E74B5" w:color="2E74B5" w:val="clear"/>
         <w:spacing w:after="120" w:before="280"/>
         <w:jc w:val="left"/>
@@ -11988,23 +11903,6 @@
     </w:p>
     <w:p>
       <w:pPr>
-        <w:spacing w:after="120" w:before="0"/>
-        <w:jc w:val="left"/>
-      </w:pPr>
-      <w:r>
-        <w:rPr>
-          <w:rFonts w:ascii="Arial" w:cs="Arial" w:eastAsia="Arial" w:hAnsi="Arial"/>
-          <w:i/>
-          <w:iCs/>
-          <w:color w:val="2E74B5"/>
-          <w:sz w:val="20"/>
-          <w:szCs w:val="20"/>
-        </w:rPr>
-        <w:t xml:space="preserve">Aula 06 · 10/08/2026</w:t>
-      </w:r>
-    </w:p>
-    <w:p>
-      <w:pPr>
         <w:shd w:fill="2E74B5" w:color="2E74B5" w:val="clear"/>
         <w:spacing w:after="120" w:before="280"/>
         <w:jc w:val="left"/>
@@ -13301,23 +13199,6 @@
     </w:p>
     <w:p>
       <w:pPr>
-        <w:spacing w:after="120" w:before="0"/>
-        <w:jc w:val="left"/>
-      </w:pPr>
-      <w:r>
-        <w:rPr>
-          <w:rFonts w:ascii="Arial" w:cs="Arial" w:eastAsia="Arial" w:hAnsi="Arial"/>
-          <w:i/>
-          <w:iCs/>
-          <w:color w:val="2E74B5"/>
-          <w:sz w:val="20"/>
-          <w:szCs w:val="20"/>
-        </w:rPr>
-        <w:t xml:space="preserve">Aula 07 · 11/08/2026</w:t>
-      </w:r>
-    </w:p>
-    <w:p>
-      <w:pPr>
         <w:shd w:fill="2E74B5" w:color="2E74B5" w:val="clear"/>
         <w:spacing w:after="120" w:before="280"/>
         <w:jc w:val="left"/>
@@ -14056,23 +13937,6 @@
           <w:szCs w:val="32"/>
         </w:rPr>
         <w:t xml:space="preserve">Capítulo 9 — Textos Técnicos e Comunicação Profissional</w:t>
-      </w:r>
-    </w:p>
-    <w:p>
-      <w:pPr>
-        <w:spacing w:after="120" w:before="0"/>
-        <w:jc w:val="left"/>
-      </w:pPr>
-      <w:r>
-        <w:rPr>
-          <w:rFonts w:ascii="Arial" w:cs="Arial" w:eastAsia="Arial" w:hAnsi="Arial"/>
-          <w:i/>
-          <w:iCs/>
-          <w:color w:val="2E74B5"/>
-          <w:sz w:val="20"/>
-          <w:szCs w:val="20"/>
-        </w:rPr>
-        <w:t xml:space="preserve">Aula 08 · 12/08/2026</w:t>
       </w:r>
     </w:p>
     <w:p>
@@ -15345,23 +15209,6 @@
           <w:szCs w:val="32"/>
         </w:rPr>
         <w:t xml:space="preserve">Capítulo 10 — Ferramentas Microsoft 365</w:t>
-      </w:r>
-    </w:p>
-    <w:p>
-      <w:pPr>
-        <w:spacing w:after="120" w:before="0"/>
-        <w:jc w:val="left"/>
-      </w:pPr>
-      <w:r>
-        <w:rPr>
-          <w:rFonts w:ascii="Arial" w:cs="Arial" w:eastAsia="Arial" w:hAnsi="Arial"/>
-          <w:i/>
-          <w:iCs/>
-          <w:color w:val="2E74B5"/>
-          <w:sz w:val="20"/>
-          <w:szCs w:val="20"/>
-        </w:rPr>
-        <w:t xml:space="preserve">Aula 13 · 24/08/2026</w:t>
       </w:r>
     </w:p>
     <w:p>

</xml_diff>